<commit_message>
docs(chuyende): bo sung so do kien truc va hinh anh minh hoa vao chuyen de 5, 6, 7, 8
</commit_message>
<xml_diff>
--- a/CHUYENDE/Chuyên đề 5 Export.docx
+++ b/CHUYENDE/Chuyên đề 5 Export.docx
@@ -3038,6 +3038,67 @@
     </w:p>
     <w:p>
       <w:pPr>
+        <w:spacing w:before="180" w:after="80" w:line="360" w:lineRule="auto"/>
+        <w:jc w:val="center"/>
+      </w:pPr>
+      <w:r>
+        <w:drawing>
+          <wp:inline distB="0" distT="0" distL="0" distR="0">
+            <wp:extent cx="5486400" cy="3086100"/>
+            <wp:effectExtent b="0" l="0" r="0" t="0"/>
+            <wp:docPr id="132168" name="export_engine_diagram.jpg"/>
+            <a:graphic xmlns:a="http://schemas.openxmlformats.org/drawingml/2006/main">
+              <a:graphicData uri="http://schemas.openxmlformats.org/drawingml/2006/picture">
+                <pic:pic xmlns:pic="http://schemas.openxmlformats.org/drawingml/2006/picture">
+                  <pic:nvPicPr>
+                    <pic:cNvPr id="0" name="export_engine_diagram.jpg"/>
+                    <pic:cNvPicPr preferRelativeResize="0"/>
+                  </pic:nvPicPr>
+                  <pic:blipFill>
+                    <a:blip xmlns:r="http://schemas.openxmlformats.org/officeDocument/2006/relationships" r:embed="rIdExpDiag"/>
+                    <a:stretch>
+                      <a:fillRect/>
+                    </a:stretch>
+                  </pic:blipFill>
+                  <pic:spPr>
+                    <a:xfrm>
+                      <a:off x="0" y="0"/>
+                      <a:ext cx="5486400" cy="3086100"/>
+                    </a:xfrm>
+                    <a:prstGeom prst="rect">
+                      <a:avLst/>
+                    </a:prstGeom>
+                    <a:ln/>
+                  </pic:spPr>
+                </pic:pic>
+              </a:graphicData>
+            </a:graphic>
+          </wp:inline>
+        </w:drawing>
+      </w:r>
+    </w:p>
+    <w:p>
+      <w:pPr>
+        <w:spacing w:before="60" w:after="180" w:line="360" w:lineRule="auto"/>
+        <w:jc w:val="center"/>
+        <w:rPr>
+          <w:i w:val="1"/>
+          <w:sz w:val="22"/>
+          <w:color w:val="595959"/>
+        </w:rPr>
+      </w:pPr>
+      <w:r>
+        <w:rPr>
+          <w:i w:val="1"/>
+          <w:sz w:val="22"/>
+          <w:color w:val="595959"/>
+          <w:rtl w:val="0"/>
+        </w:rPr>
+        <w:t xml:space="preserve">Hình 5.1: Sơ đồ Kiến trúc Phân hệ Xuất Báo cáo &amp; Định dạng Dữ liệu (Export Engine Architecture)</w:t>
+      </w:r>
+    </w:p>
+    <w:p>
+      <w:pPr>
         <w:spacing w:after="120" w:line="360" w:lineRule="auto"/>
         <w:ind w:firstLine="360"/>
         <w:rPr>
@@ -4244,6 +4305,67 @@
     </w:p>
     <w:p>
       <w:pPr>
+        <w:spacing w:before="180" w:after="80" w:line="360" w:lineRule="auto"/>
+        <w:jc w:val="center"/>
+      </w:pPr>
+      <w:r>
+        <w:drawing>
+          <wp:inline distB="0" distT="0" distL="0" distR="0">
+            <wp:extent cx="5486400" cy="3086100"/>
+            <wp:effectExtent b="0" l="0" r="0" t="0"/>
+            <wp:docPr id="401377" name="bgh_gradebook_approval.png"/>
+            <a:graphic xmlns:a="http://schemas.openxmlformats.org/drawingml/2006/main">
+              <a:graphicData uri="http://schemas.openxmlformats.org/drawingml/2006/picture">
+                <pic:pic xmlns:pic="http://schemas.openxmlformats.org/drawingml/2006/picture">
+                  <pic:nvPicPr>
+                    <pic:cNvPr id="0" name="bgh_gradebook_approval.png"/>
+                    <pic:cNvPicPr preferRelativeResize="0"/>
+                  </pic:nvPicPr>
+                  <pic:blipFill>
+                    <a:blip xmlns:r="http://schemas.openxmlformats.org/officeDocument/2006/relationships" r:embed="rIdGradebookImg"/>
+                    <a:stretch>
+                      <a:fillRect/>
+                    </a:stretch>
+                  </pic:blipFill>
+                  <pic:spPr>
+                    <a:xfrm>
+                      <a:off x="0" y="0"/>
+                      <a:ext cx="5486400" cy="3086100"/>
+                    </a:xfrm>
+                    <a:prstGeom prst="rect">
+                      <a:avLst/>
+                    </a:prstGeom>
+                    <a:ln/>
+                  </pic:spPr>
+                </pic:pic>
+              </a:graphicData>
+            </a:graphic>
+          </wp:inline>
+        </w:drawing>
+      </w:r>
+    </w:p>
+    <w:p>
+      <w:pPr>
+        <w:spacing w:before="60" w:after="180" w:line="360" w:lineRule="auto"/>
+        <w:jc w:val="center"/>
+        <w:rPr>
+          <w:i w:val="1"/>
+          <w:sz w:val="22"/>
+          <w:color w:val="595959"/>
+        </w:rPr>
+      </w:pPr>
+      <w:r>
+        <w:rPr>
+          <w:i w:val="1"/>
+          <w:sz w:val="22"/>
+          <w:color w:val="595959"/>
+          <w:rtl w:val="0"/>
+        </w:rPr>
+        <w:t xml:space="preserve">Hình 5.2: Giao diện Sổ điểm Lớp học trên Web Portal chuẩn bị trích xuất sang Excel .xlsx</w:t>
+      </w:r>
+    </w:p>
+    <w:p>
+      <w:pPr>
         <w:pStyle w:val="Heading2"/>
         <w:spacing w:before="200" w:after="100" w:line="360" w:lineRule="auto"/>
         <w:ind w:left="360" w:firstLine="0"/>
@@ -5102,6 +5224,67 @@
           <w:rtl w:val="0"/>
         </w:rPr>
         <w:t xml:space="preserve">}</w:t>
+      </w:r>
+    </w:p>
+    <w:p>
+      <w:pPr>
+        <w:spacing w:before="180" w:after="80" w:line="360" w:lineRule="auto"/>
+        <w:jc w:val="center"/>
+      </w:pPr>
+      <w:r>
+        <w:drawing>
+          <wp:inline distB="0" distT="0" distL="0" distR="0">
+            <wp:extent cx="5486400" cy="3086100"/>
+            <wp:effectExtent b="0" l="0" r="0" t="0"/>
+            <wp:docPr id="339393" name="parent_report_card.png"/>
+            <a:graphic xmlns:a="http://schemas.openxmlformats.org/drawingml/2006/main">
+              <a:graphicData uri="http://schemas.openxmlformats.org/drawingml/2006/picture">
+                <pic:pic xmlns:pic="http://schemas.openxmlformats.org/drawingml/2006/picture">
+                  <pic:nvPicPr>
+                    <pic:cNvPr id="0" name="parent_report_card.png"/>
+                    <pic:cNvPicPr preferRelativeResize="0"/>
+                  </pic:nvPicPr>
+                  <pic:blipFill>
+                    <a:blip xmlns:r="http://schemas.openxmlformats.org/officeDocument/2006/relationships" r:embed="rIdRepCardImg"/>
+                    <a:stretch>
+                      <a:fillRect/>
+                    </a:stretch>
+                  </pic:blipFill>
+                  <pic:spPr>
+                    <a:xfrm>
+                      <a:off x="0" y="0"/>
+                      <a:ext cx="5486400" cy="3086100"/>
+                    </a:xfrm>
+                    <a:prstGeom prst="rect">
+                      <a:avLst/>
+                    </a:prstGeom>
+                    <a:ln/>
+                  </pic:spPr>
+                </pic:pic>
+              </a:graphicData>
+            </a:graphic>
+          </wp:inline>
+        </w:drawing>
+      </w:r>
+    </w:p>
+    <w:p>
+      <w:pPr>
+        <w:spacing w:before="60" w:after="180" w:line="360" w:lineRule="auto"/>
+        <w:jc w:val="center"/>
+        <w:rPr>
+          <w:i w:val="1"/>
+          <w:sz w:val="22"/>
+          <w:color w:val="595959"/>
+        </w:rPr>
+      </w:pPr>
+      <w:r>
+        <w:rPr>
+          <w:i w:val="1"/>
+          <w:sz w:val="22"/>
+          <w:color w:val="595959"/>
+          <w:rtl w:val="0"/>
+        </w:rPr>
+        <w:t xml:space="preserve">Hình 5.3: Giao diện Mẫu Phiếu báo điểm Học sinh được trích xuất bằng jsPDF Engine trên Cổng Phụ huynh</w:t>
       </w:r>
     </w:p>
     <w:p>

</xml_diff>